<commit_message>
Protocolo de retirada: avaliação das notas à proposta OMV/ANVETEM
Avaliação das 45 notas manuscritas do ficheiro anotado (transcrição,
validade, se já constavam da análise e fundamento), em Word gerado por
_avaliacao_notas_proposta.py.

Análise v1.1: acrescentada a via do DL 315/2009 (animais perigosos e
agressores) e corrigido o destino na via do DL 314/2003 (decide o MVM,
art. 9.º, n.º 1).

Memorando RGAC 1.23: ficha S-02 completada com a origem do «retorno ao
local de origem» no DL 315/2009, art. 39.º, e a remissão para o RJCE que o
RGAC deixa cair.

Co-Authored-By: Claude Opus 5.5 <noreply@anthropic.com>
Claude-Session: https://claude.ai/code/session_01HVdseQDU3TzmMp7vD8ambZ
</commit_message>
<xml_diff>
--- a/Protocolo de retirada de alojamentos/Analise_Proposta_OMV_ANVETEM_Retirada_e_Socorro.docx
+++ b/Protocolo de retirada de alojamentos/Analise_Proposta_OMV_ANVETEM_Retirada_e_Socorro.docx
@@ -81,7 +81,7 @@
           <w:color w:val="555555"/>
           <w:sz w:val="18"/>
         </w:rPr>
-        <w:t>Documento de trabalho, 14.10.2026. Analisa apenas o ficheiro «Proposta de Procedimento Integrado_DGAV_OMV_ANVETEM_v26_08_2026_signed_signed.pdf».</w:t>
+        <w:t>Documento de trabalho, 14.10.2026 (v1.1: acrescentada a via do DL 315/2009 e corrigido o destino na via do DL 314/2003, na sequência das notas ao ficheiro anotado). Analisa o ficheiro «Proposta de Procedimento Integrado_DGAV_OMV_ANVETEM_v26_08_2026_signed_signed.pdf».</w:t>
       </w:r>
     </w:p>
     <w:p>
@@ -1801,6 +1801,25 @@
     </w:p>
     <w:p>
       <w:pPr>
+        <w:pStyle w:val="ListBullet"/>
+        <w:spacing w:after="60"/>
+        <w:jc w:val="both"/>
+      </w:pPr>
+      <w:r>
+        <w:rPr>
+          <w:b/>
+        </w:rPr>
+        <w:t xml:space="preserve">f) </w:t>
+      </w:r>
+      <w:r>
+        <w:rPr>
+          <w:sz w:val="21"/>
+        </w:rPr>
+        <w:t>Cão que agrediu uma pessoa, ou cão perigoso ou potencialmente perigoso detido sem as condições legais.</w:t>
+      </w:r>
+    </w:p>
+    <w:p>
+      <w:pPr>
         <w:keepNext/>
         <w:spacing w:before="240" w:after="80"/>
       </w:pPr>
@@ -1810,7 +1829,7 @@
           <w:color w:val="1F3B63"/>
           <w:sz w:val="23"/>
         </w:rPr>
-        <w:t>4.2 Legislação vigente: seis vias, seis decisores</w:t>
+        <w:t>4.2 Legislação vigente: sete vias, vários decisores</w:t>
       </w:r>
     </w:p>
     <w:p>
@@ -2502,7 +2521,7 @@
               <w:rPr>
                 <w:sz w:val="16"/>
               </w:rPr>
-              <w:t>Regime do CRO</w:t>
+              <w:t>MVM, após exame clínico e permanência mínima de oito dias (DL 314/2003, art.º 9.º, n.º 1)</w:t>
             </w:r>
           </w:p>
         </w:tc>
@@ -2613,6 +2632,116 @@
                 <w:sz w:val="16"/>
               </w:rPr>
               <w:t>Presunção de abandono aos 15 dias e encaminhamento para adoção</w:t>
+            </w:r>
+          </w:p>
+        </w:tc>
+      </w:tr>
+      <w:tr>
+        <w:tc>
+          <w:tcPr>
+            <w:tcW w:type="dxa" w:w="1247"/>
+          </w:tcPr>
+          <w:p>
+            <w:pPr>
+              <w:spacing w:after="40"/>
+              <w:jc w:val="left"/>
+            </w:pPr>
+            <w:r/>
+            <w:r>
+              <w:rPr>
+                <w:sz w:val="16"/>
+              </w:rPr>
+              <w:t>V7. Animais perigosos e agressores</w:t>
+            </w:r>
+          </w:p>
+        </w:tc>
+        <w:tc>
+          <w:tcPr>
+            <w:tcW w:type="dxa" w:w="2041"/>
+          </w:tcPr>
+          <w:p>
+            <w:pPr>
+              <w:spacing w:after="40"/>
+              <w:jc w:val="left"/>
+            </w:pPr>
+            <w:r/>
+            <w:r>
+              <w:rPr>
+                <w:sz w:val="16"/>
+              </w:rPr>
+              <w:t>DL 315/2009, arts. 14.º, 15.º, 30.º, n.º 3, 30.º-A e 39.º</w:t>
+            </w:r>
+          </w:p>
+        </w:tc>
+        <w:tc>
+          <w:tcPr>
+            <w:tcW w:type="dxa" w:w="1474"/>
+          </w:tcPr>
+          <w:p>
+            <w:pPr>
+              <w:spacing w:after="40"/>
+              <w:jc w:val="left"/>
+            </w:pPr>
+            <w:r/>
+            <w:r>
+              <w:rPr>
+                <w:sz w:val="16"/>
+              </w:rPr>
+              <w:t>Autoridade competente; MVM (destino e eutanásia do agressor)</w:t>
+            </w:r>
+          </w:p>
+        </w:tc>
+        <w:tc>
+          <w:tcPr>
+            <w:tcW w:type="dxa" w:w="1361"/>
+          </w:tcPr>
+          <w:p>
+            <w:pPr>
+              <w:spacing w:after="40"/>
+              <w:jc w:val="left"/>
+            </w:pPr>
+            <w:r/>
+            <w:r>
+              <w:rPr>
+                <w:sz w:val="16"/>
+              </w:rPr>
+              <w:t>Autoridades do art.º 30.º; mandado do tribunal cível da comarca</w:t>
+            </w:r>
+          </w:p>
+        </w:tc>
+        <w:tc>
+          <w:tcPr>
+            <w:tcW w:type="dxa" w:w="1474"/>
+          </w:tcPr>
+          <w:p>
+            <w:pPr>
+              <w:spacing w:after="40"/>
+              <w:jc w:val="left"/>
+            </w:pPr>
+            <w:r/>
+            <w:r>
+              <w:rPr>
+                <w:sz w:val="16"/>
+              </w:rPr>
+              <w:t>CRO (art.º 14.º); fiel depositário, nos termos do RJCE (art.º 39.º)</w:t>
+            </w:r>
+          </w:p>
+        </w:tc>
+        <w:tc>
+          <w:tcPr>
+            <w:tcW w:type="dxa" w:w="1474"/>
+          </w:tcPr>
+          <w:p>
+            <w:pPr>
+              <w:spacing w:after="40"/>
+              <w:jc w:val="left"/>
+            </w:pPr>
+            <w:r/>
+            <w:r>
+              <w:rPr>
+                <w:sz w:val="16"/>
+              </w:rPr>
+              <w:t>MVM (art.º 15.º); perda e privação de detenção (art.º 30.º-A)</w:t>
             </w:r>
           </w:p>
         </w:tc>
@@ -4234,7 +4363,7 @@
               <w:rPr>
                 <w:sz w:val="17"/>
               </w:rPr>
-              <w:t>Há seis vias com decisores diferentes (quadro 4.2). Só a lei pode ordená-las.</w:t>
+              <w:t>Há sete vias com decisores diferentes (quadro 4.2). Só a lei pode ordená-las.</w:t>
             </w:r>
           </w:p>
         </w:tc>
@@ -4705,7 +4834,7 @@
         <w:rPr>
           <w:sz w:val="21"/>
         </w:rPr>
-        <w:t>com o art.º 1.º-A, o art.º 9.º e o n.º 1 do art.º 10.º da Lei n.º 92/95; os arts. 159.º-A, 178.º, 186.º e 249.º do CPP; os arts. 48.º a 52.º do RJCE; o art.º 3.º do DL 314/2003; o art.º 3.º da Lei n.º 27/2016; os arts. 8.º e 11.º do DL 82/2019.</w:t>
+        <w:t>com o art.º 1.º-A, o art.º 9.º e o n.º 1 do art.º 10.º da Lei n.º 92/95; os arts. 159.º-A, 178.º, 186.º e 249.º do CPP; os arts. 48.º a 52.º do RJCE; o art.º 3.º do DL 314/2003; o art.º 3.º da Lei n.º 27/2016; os arts. 8.º e 11.º do DL 82/2019; os arts. 14.º, 15.º, 30.º e 39.º do DL 315/2009.</w:t>
       </w:r>
     </w:p>
     <w:p>
@@ -6561,7 +6690,7 @@
         <w:t xml:space="preserve">Apreciação. </w:t>
       </w:r>
       <w:r>
-        <w:t>O projeto passa a recolha por bem-estar da DGAV para as câmaras e a decisão de destino da DGAV para o médico veterinário municipal. A proposta OMV/ANVETEM assenta no modelo vigente, com a DGAV a decidir. Se o RGAC for aprovado assim, o procedimento terá de ser refeito. O art.º 139.º regula a apreensão só para contraordenações, sem articulação com o CPP nem com o RJCE, e admite o «retorno ao local de origem», que em maus-tratos é o pior destino possível. O art.º 98.º, n.º 13 mantém a presunção de 15 dias sem ressalva para animais apreendidos ou socorridos. O projeto não tem norma sobre emergências nem refere a Lei n.º 38/2026. A DGAV tem vantagem em fazer convergir agora as duas peças: o procedimento e o RGAC. Estes pontos foram registados no memorando de acompanhamento do RGAC.</w:t>
+        <w:t>O projeto passa a recolha por bem-estar da DGAV para as câmaras e a decisão de destino da DGAV para o médico veterinário municipal. A proposta OMV/ANVETEM assenta no modelo vigente, com a DGAV a decidir. Se o RGAC for aprovado assim, o procedimento terá de ser refeito. O art.º 139.º regula a apreensão só para contraordenações, sem articulação com o CPP nem com o RJCE, e admite o «retorno ao local de origem», que em maus-tratos é o pior destino possível. Essa fórmula vem do DL 315/2009 (art.º 39.º, n.º 8), cujo n.º 1 já remete a apreensão para o RJCE; o RGAC deixa cair essa remissão. O art.º 98.º, n.º 13 mantém a presunção de 15 dias sem ressalva para animais apreendidos ou socorridos. O projeto não tem norma sobre emergências nem refere a Lei n.º 38/2026. A DGAV tem vantagem em fazer convergir agora as duas peças: o procedimento e o RGAC. Estes pontos foram registados no memorando de acompanhamento do RGAC.</w:t>
       </w:r>
     </w:p>
     <w:p>
@@ -9564,7 +9693,7 @@
               <w:rPr>
                 <w:sz w:val="17"/>
               </w:rPr>
-              <w:t>DL 314/2003, art.º 3.º</w:t>
+              <w:t>DL 314/2003, arts. 3.º e 9.º</w:t>
             </w:r>
           </w:p>
         </w:tc>
@@ -9582,7 +9711,7 @@
               <w:rPr>
                 <w:sz w:val="17"/>
               </w:rPr>
-              <w:t>repositório: CHECKPOINT-FOGO-vs-ALOJAMENTO-REGISTADO.md (conferido no DR)</w:t>
+              <w:t>repositório: Legislação vigente/ (versão consolidada) e CHECKPOINT-FOGO-vs-ALOJAMENTO-REGISTADO.md (conferido no DR)</w:t>
             </w:r>
           </w:p>
         </w:tc>
@@ -9600,7 +9729,63 @@
               <w:rPr>
                 <w:sz w:val="17"/>
               </w:rPr>
-              <w:t>Conferido em estudo anterior</w:t>
+              <w:t>Conferido</w:t>
+            </w:r>
+          </w:p>
+        </w:tc>
+      </w:tr>
+      <w:tr>
+        <w:tc>
+          <w:tcPr>
+            <w:tcW w:type="dxa" w:w="2835"/>
+          </w:tcPr>
+          <w:p>
+            <w:pPr>
+              <w:spacing w:after="40"/>
+              <w:jc w:val="left"/>
+            </w:pPr>
+            <w:r/>
+            <w:r>
+              <w:rPr>
+                <w:sz w:val="17"/>
+              </w:rPr>
+              <w:t>DL 315/2009, arts. 14.º, 15.º, 30.º, 30.º-A e 39.º</w:t>
+            </w:r>
+          </w:p>
+        </w:tc>
+        <w:tc>
+          <w:tcPr>
+            <w:tcW w:type="dxa" w:w="3969"/>
+          </w:tcPr>
+          <w:p>
+            <w:pPr>
+              <w:spacing w:after="40"/>
+              <w:jc w:val="left"/>
+            </w:pPr>
+            <w:r/>
+            <w:r>
+              <w:rPr>
+                <w:sz w:val="17"/>
+              </w:rPr>
+              <w:t>repositório: Legislação vigente/ (versão consolidada)</w:t>
+            </w:r>
+          </w:p>
+        </w:tc>
+        <w:tc>
+          <w:tcPr>
+            <w:tcW w:type="dxa" w:w="2268"/>
+          </w:tcPr>
+          <w:p>
+            <w:pPr>
+              <w:spacing w:after="40"/>
+              <w:jc w:val="left"/>
+            </w:pPr>
+            <w:r/>
+            <w:r>
+              <w:rPr>
+                <w:sz w:val="17"/>
+              </w:rPr>
+              <w:t>Conferido</w:t>
             </w:r>
           </w:p>
         </w:tc>

</xml_diff>